<commit_message>
Condense limitations, add Key Caveats section, fix N_d subscript notation, KaTeX for equations
</commit_message>
<xml_diff>
--- a/docs/How the Metrics Are Computed.docx
+++ b/docs/How the Metrics Are Computed.docx
@@ -1032,7 +1032,7 @@
         <w:spacing w:after="120" w:line="288" w:lineRule="auto"/>
       </w:pPr>
       <w:r>
-        <w:t>Workplace impact metrics do not use the full respondent count as their base. Instead, they use a stricter sub-population called the Impact Denominator (denoted Nᵈ below).</w:t>
+        <w:t>Workplace impact metrics do not use the full respondent count as their base. Instead, they use a stricter sub-population called the Impact Denominator (denoted N_d below, where the subscript d stands for 'denominator').</w:t>
       </w:r>
     </w:p>
     <w:p>
@@ -1128,9 +1128,18 @@
               </m:r>
             </m:num>
             <m:den>
-              <m:r>
-                <m:t>Nᵈ</m:t>
-              </m:r>
+              <m:sSub>
+                <m:e>
+                  <m:r>
+                    <m:t>N</m:t>
+                  </m:r>
+                </m:e>
+                <m:sub>
+                  <m:r>
+                    <m:t>d</m:t>
+                  </m:r>
+                </m:sub>
+              </m:sSub>
             </m:den>
           </m:f>
         </m:oMath>
@@ -1921,9 +1930,18 @@
               </m:r>
             </m:num>
             <m:den>
-              <m:r>
-                <m:t>Nᵈ</m:t>
-              </m:r>
+              <m:sSub>
+                <m:e>
+                  <m:r>
+                    <m:t>N</m:t>
+                  </m:r>
+                </m:e>
+                <m:sub>
+                  <m:r>
+                    <m:t>d</m:t>
+                  </m:r>
+                </m:sub>
+              </m:sSub>
             </m:den>
           </m:f>
         </m:oMath>
@@ -1946,9 +1964,18 @@
               </m:r>
             </m:num>
             <m:den>
-              <m:r>
-                <m:t>Nᵈ</m:t>
-              </m:r>
+              <m:sSub>
+                <m:e>
+                  <m:r>
+                    <m:t>N</m:t>
+                  </m:r>
+                </m:e>
+                <m:sub>
+                  <m:r>
+                    <m:t>d</m:t>
+                  </m:r>
+                </m:sub>
+              </m:sSub>
             </m:den>
           </m:f>
         </m:oMath>
@@ -2709,9 +2736,18 @@
               </m:r>
             </m:num>
             <m:den>
-              <m:r>
-                <m:t>Nᵈ</m:t>
-              </m:r>
+              <m:sSub>
+                <m:e>
+                  <m:r>
+                    <m:t>N</m:t>
+                  </m:r>
+                </m:e>
+                <m:sub>
+                  <m:r>
+                    <m:t>d</m:t>
+                  </m:r>
+                </m:sub>
+              </m:sSub>
             </m:den>
           </m:f>
           <m:nary>
@@ -2991,8 +3027,20 @@
             </m:num>
             <m:den>
               <m:r>
-                <m:t>√Nᵈ</m:t>
+                <m:t>√</m:t>
               </m:r>
+              <m:sSub>
+                <m:e>
+                  <m:r>
+                    <m:t>N</m:t>
+                  </m:r>
+                </m:e>
+                <m:sub>
+                  <m:r>
+                    <m:t>d</m:t>
+                  </m:r>
+                </m:sub>
+              </m:sSub>
             </m:den>
           </m:f>
         </m:oMath>
@@ -3016,7 +3064,7 @@
         <w:spacing w:after="120" w:line="288" w:lineRule="auto"/>
       </w:pPr>
       <w:r>
-        <w:t>where σ is the standard deviation of the personal scores and Nᵈ is the impact denominator size.</w:t>
+        <w:t>where σ is the standard deviation of the personal scores and N_d is the impact denominator size.</w:t>
       </w:r>
     </w:p>
     <w:p>

</xml_diff>